<commit_message>
Tambah kalimat jembatan, panduan penempatan, & atribusi baseline
- Tambah kalimat jembatan sebelum/antara/sesudah Tabel A1-A2 (alur ke 1.2)
- Ganti atribusi sumber data: VolMon -> penyisiran/observasi awal (baseline)
- Tambah Tabel P1 (panduan penempatan tabel & gambar di file master)
- Tambah Tabel P2 (pemetaan file SVG -> nomor Gambar di master)
- Update subtitle infografik gambar4 ke sumber baseline
</commit_message>
<xml_diff>
--- a/REVISI Langkah 1 & 2 - VOLMON.docx
+++ b/REVISI Langkah 1 & 2 - VOLMON.docx
@@ -55,6 +55,767 @@
           <w:szCs w:val="28"/>
           <w:color w:val="1F3864"/>
         </w:rPr>
+        <w:t xml:space="preserve">PANDUAN PENEMPATAN DI FILE MASTER (VOLMON_FIX.docx)</w:t>
+      </w:r>
+    </w:p>
+    <w:p>
+      <w:pPr>
+        <w:spacing w:after="120"/>
+      </w:pPr>
+      <w:r>
+        <w:t xml:space="preserve">Tabel berikut memetakan setiap tabel/gambar baru ke lokasi penyisipannya di file master, termasuk kalimat acuan setelah mana elemen tersebut diletakkan.</w:t>
+      </w:r>
+    </w:p>
+    <w:p>
+      <w:pPr>
+        <w:spacing w:after="60"/>
+      </w:pPr>
+      <w:r>
+        <w:rPr>
+          <w:b/>
+          <w:sz w:val="20"/>
+          <w:szCs w:val="20"/>
+        </w:rPr>
+        <w:t xml:space="preserve">Tabel P1  Panduan Penempatan Tabel &amp; Gambar</w:t>
+      </w:r>
+    </w:p>
+    <w:tbl>
+      <w:tblPr>
+        <w:tblStyle w:val="TableGrid"/>
+        <w:tblW w:w="9300" w:type="dxa"/>
+        <w:tblBorders>
+          <w:top w:val="single" w:sz="4" w:space="0" w:color="808080"/>
+          <w:left w:val="single" w:sz="4" w:space="0" w:color="808080"/>
+          <w:bottom w:val="single" w:sz="4" w:space="0" w:color="808080"/>
+          <w:right w:val="single" w:sz="4" w:space="0" w:color="808080"/>
+          <w:insideH w:val="single" w:sz="4" w:space="0" w:color="808080"/>
+          <w:insideV w:val="single" w:sz="4" w:space="0" w:color="808080"/>
+        </w:tblBorders>
+      </w:tblPr>
+      <w:tblGrid>
+        <w:gridCol w:w="3000"/>
+        <w:gridCol w:w="4800"/>
+        <w:gridCol w:w="1500"/>
+      </w:tblGrid>
+      <w:tr>
+        <w:trPr>
+          <w:tblHeader/>
+        </w:trPr>
+        <w:tc>
+          <w:tcPr>
+            <w:tcW w:w="3000" w:type="dxa"/>
+            <w:shd w:val="clear" w:color="auto" w:fill="D9E2F3"/>
+            <w:vAlign w:val="center"/>
+          </w:tcPr>
+          <w:p>
+            <w:pPr>
+              <w:spacing w:after="40"/>
+              <w:jc w:val="center"/>
+            </w:pPr>
+            <w:r>
+              <w:rPr>
+                <w:b/>
+              </w:rPr>
+              <w:t xml:space="preserve">Elemen</w:t>
+            </w:r>
+          </w:p>
+        </w:tc>
+        <w:tc>
+          <w:tcPr>
+            <w:tcW w:w="4800" w:type="dxa"/>
+            <w:shd w:val="clear" w:color="auto" w:fill="D9E2F3"/>
+            <w:vAlign w:val="center"/>
+          </w:tcPr>
+          <w:p>
+            <w:pPr>
+              <w:spacing w:after="40"/>
+              <w:jc w:val="center"/>
+            </w:pPr>
+            <w:r>
+              <w:rPr>
+                <w:b/>
+              </w:rPr>
+              <w:t xml:space="preserve">Letakkan setelah / pada</w:t>
+            </w:r>
+          </w:p>
+        </w:tc>
+        <w:tc>
+          <w:tcPr>
+            <w:tcW w:w="1500" w:type="dxa"/>
+            <w:shd w:val="clear" w:color="auto" w:fill="D9E2F3"/>
+            <w:vAlign w:val="center"/>
+          </w:tcPr>
+          <w:p>
+            <w:pPr>
+              <w:spacing w:after="40"/>
+              <w:jc w:val="center"/>
+            </w:pPr>
+            <w:r>
+              <w:rPr>
+                <w:b/>
+              </w:rPr>
+              <w:t xml:space="preserve">Bagian</w:t>
+            </w:r>
+          </w:p>
+        </w:tc>
+      </w:tr>
+      <w:tr>
+        <w:tc>
+          <w:tcPr>
+            <w:tcW w:w="3000" w:type="dxa"/>
+            <w:vAlign w:val="center"/>
+          </w:tcPr>
+          <w:p>
+            <w:pPr>
+              <w:spacing w:after="40"/>
+            </w:pPr>
+            <w:r>
+              <w:t xml:space="preserve">Kalimat jembatan + Tabel A1 + Infografik data pending + Tabel A2 + kalimat penutup</w:t>
+            </w:r>
+          </w:p>
+        </w:tc>
+        <w:tc>
+          <w:tcPr>
+            <w:tcW w:w="4800" w:type="dxa"/>
+            <w:vAlign w:val="center"/>
+          </w:tcPr>
+          <w:p>
+            <w:pPr>
+              <w:spacing w:after="40"/>
+            </w:pPr>
+            <w:r>
+              <w:t xml:space="preserve">Kalimat penutup Pareto: “...tema perbaikan difokuskan pada peningkatan efektivitas monitoring sinkronisasi data gate.” (akhir sub-bab 1.1, setelah Gambar 3)</w:t>
+            </w:r>
+          </w:p>
+        </w:tc>
+        <w:tc>
+          <w:tcPr>
+            <w:tcW w:w="1500" w:type="dxa"/>
+            <w:vAlign w:val="center"/>
+          </w:tcPr>
+          <w:p>
+            <w:pPr>
+              <w:spacing w:after="40"/>
+            </w:pPr>
+            <w:r>
+              <w:t xml:space="preserve">1.1 Identifikasi Masalah</w:t>
+            </w:r>
+          </w:p>
+        </w:tc>
+      </w:tr>
+      <w:tr>
+        <w:tc>
+          <w:tcPr>
+            <w:tcW w:w="3000" w:type="dxa"/>
+            <w:vAlign w:val="center"/>
+          </w:tcPr>
+          <w:p>
+            <w:pPr>
+              <w:spacing w:after="40"/>
+            </w:pPr>
+            <w:r>
+              <w:t xml:space="preserve">Pembaruan baris Risiko Revenue (Before-After)</w:t>
+            </w:r>
+          </w:p>
+        </w:tc>
+        <w:tc>
+          <w:tcPr>
+            <w:tcW w:w="4800" w:type="dxa"/>
+            <w:vAlign w:val="center"/>
+          </w:tcPr>
+          <w:p>
+            <w:pPr>
+              <w:spacing w:after="40"/>
+            </w:pPr>
+            <w:r>
+              <w:t xml:space="preserve">Pada Tabel 6 Before-After yang sudah ada (ganti isi baris Risiko revenue)</w:t>
+            </w:r>
+          </w:p>
+        </w:tc>
+        <w:tc>
+          <w:tcPr>
+            <w:tcW w:w="1500" w:type="dxa"/>
+            <w:vAlign w:val="center"/>
+          </w:tcPr>
+          <w:p>
+            <w:pPr>
+              <w:spacing w:after="40"/>
+            </w:pPr>
+            <w:r>
+              <w:t xml:space="preserve">1.2 Dampak &amp; Harapan</w:t>
+            </w:r>
+          </w:p>
+        </w:tc>
+      </w:tr>
+      <w:tr>
+        <w:tc>
+          <w:tcPr>
+            <w:tcW w:w="3000" w:type="dxa"/>
+            <w:vAlign w:val="center"/>
+          </w:tcPr>
+          <w:p>
+            <w:pPr>
+              <w:spacing w:after="40"/>
+            </w:pPr>
+            <w:r>
+              <w:t xml:space="preserve">Pembaruan baseline Aspek Quality</w:t>
+            </w:r>
+          </w:p>
+        </w:tc>
+        <w:tc>
+          <w:tcPr>
+            <w:tcW w:w="4800" w:type="dxa"/>
+            <w:vAlign w:val="center"/>
+          </w:tcPr>
+          <w:p>
+            <w:pPr>
+              <w:spacing w:after="40"/>
+            </w:pPr>
+            <w:r>
+              <w:t xml:space="preserve">Pada Tabel 7 Harapan dan Sasaran (ganti kolom Kondisi Saat Ini baris Quality)</w:t>
+            </w:r>
+          </w:p>
+        </w:tc>
+        <w:tc>
+          <w:tcPr>
+            <w:tcW w:w="1500" w:type="dxa"/>
+            <w:vAlign w:val="center"/>
+          </w:tcPr>
+          <w:p>
+            <w:pPr>
+              <w:spacing w:after="40"/>
+            </w:pPr>
+            <w:r>
+              <w:t xml:space="preserve">1.4 Sasaran Tema</w:t>
+            </w:r>
+          </w:p>
+        </w:tc>
+      </w:tr>
+      <w:tr>
+        <w:tc>
+          <w:tcPr>
+            <w:tcW w:w="3000" w:type="dxa"/>
+            <w:vAlign w:val="center"/>
+          </w:tcPr>
+          <w:p>
+            <w:pPr>
+              <w:spacing w:after="40"/>
+            </w:pPr>
+            <w:r>
+              <w:t xml:space="preserve">Tabel B1 (Pengelompokan 4M+1E)</w:t>
+            </w:r>
+          </w:p>
+        </w:tc>
+        <w:tc>
+          <w:tcPr>
+            <w:tcW w:w="4800" w:type="dxa"/>
+            <w:vAlign w:val="center"/>
+          </w:tcPr>
+          <w:p>
+            <w:pPr>
+              <w:spacing w:after="40"/>
+            </w:pPr>
+            <w:r>
+              <w:t xml:space="preserve">Menggantikan/menyempurnakan Tabel 9 Pengelompokan Penyebab</w:t>
+            </w:r>
+          </w:p>
+        </w:tc>
+        <w:tc>
+          <w:tcPr>
+            <w:tcW w:w="1500" w:type="dxa"/>
+            <w:vAlign w:val="center"/>
+          </w:tcPr>
+          <w:p>
+            <w:pPr>
+              <w:spacing w:after="40"/>
+            </w:pPr>
+            <w:r>
+              <w:t xml:space="preserve">2.1 / Memetakan Sebab Akibat</w:t>
+            </w:r>
+          </w:p>
+        </w:tc>
+      </w:tr>
+      <w:tr>
+        <w:tc>
+          <w:tcPr>
+            <w:tcW w:w="3000" w:type="dxa"/>
+            <w:vAlign w:val="center"/>
+          </w:tcPr>
+          <w:p>
+            <w:pPr>
+              <w:spacing w:after="40"/>
+            </w:pPr>
+            <w:r>
+              <w:t xml:space="preserve">Gambar 5 Fishbone (gambar5_fishbone.svg)</w:t>
+            </w:r>
+          </w:p>
+        </w:tc>
+        <w:tc>
+          <w:tcPr>
+            <w:tcW w:w="4800" w:type="dxa"/>
+            <w:vAlign w:val="center"/>
+          </w:tcPr>
+          <w:p>
+            <w:pPr>
+              <w:spacing w:after="40"/>
+            </w:pPr>
+            <w:r>
+              <w:t xml:space="preserve">Pada slot “Gambar 5 Fishbone Diagram” di sub-bab Memetakan Sebab Akibat</w:t>
+            </w:r>
+          </w:p>
+        </w:tc>
+        <w:tc>
+          <w:tcPr>
+            <w:tcW w:w="1500" w:type="dxa"/>
+            <w:vAlign w:val="center"/>
+          </w:tcPr>
+          <w:p>
+            <w:pPr>
+              <w:spacing w:after="40"/>
+            </w:pPr>
+            <w:r>
+              <w:t xml:space="preserve">2.2</w:t>
+            </w:r>
+          </w:p>
+        </w:tc>
+      </w:tr>
+      <w:tr>
+        <w:tc>
+          <w:tcPr>
+            <w:tcW w:w="3000" w:type="dxa"/>
+            <w:vAlign w:val="center"/>
+          </w:tcPr>
+          <w:p>
+            <w:pPr>
+              <w:spacing w:after="40"/>
+            </w:pPr>
+            <w:r>
+              <w:t xml:space="preserve">Tabel B2 (Why-Why)</w:t>
+            </w:r>
+          </w:p>
+        </w:tc>
+        <w:tc>
+          <w:tcPr>
+            <w:tcW w:w="4800" w:type="dxa"/>
+            <w:vAlign w:val="center"/>
+          </w:tcPr>
+          <w:p>
+            <w:pPr>
+              <w:spacing w:after="40"/>
+            </w:pPr>
+            <w:r>
+              <w:t xml:space="preserve">Setelah fishbone, sebelum sub-bab “Menganalisis Akar Penyebab”</w:t>
+            </w:r>
+          </w:p>
+        </w:tc>
+        <w:tc>
+          <w:tcPr>
+            <w:tcW w:w="1500" w:type="dxa"/>
+            <w:vAlign w:val="center"/>
+          </w:tcPr>
+          <w:p>
+            <w:pPr>
+              <w:spacing w:after="40"/>
+            </w:pPr>
+            <w:r>
+              <w:t xml:space="preserve">2.3 (baru)</w:t>
+            </w:r>
+          </w:p>
+        </w:tc>
+      </w:tr>
+      <w:tr>
+        <w:tc>
+          <w:tcPr>
+            <w:tcW w:w="3000" w:type="dxa"/>
+            <w:vAlign w:val="center"/>
+          </w:tcPr>
+          <w:p>
+            <w:pPr>
+              <w:spacing w:after="40"/>
+            </w:pPr>
+            <w:r>
+              <w:t xml:space="preserve">Tabel B3 (Pembobotan akar penyebab)</w:t>
+            </w:r>
+          </w:p>
+        </w:tc>
+        <w:tc>
+          <w:tcPr>
+            <w:tcW w:w="4800" w:type="dxa"/>
+            <w:vAlign w:val="center"/>
+          </w:tcPr>
+          <w:p>
+            <w:pPr>
+              <w:spacing w:after="40"/>
+            </w:pPr>
+            <w:r>
+              <w:t xml:space="preserve">Menggantikan Tabel 10 Akar Penyebab agar penetapan ‘dominan’ lebih objektif</w:t>
+            </w:r>
+          </w:p>
+        </w:tc>
+        <w:tc>
+          <w:tcPr>
+            <w:tcW w:w="1500" w:type="dxa"/>
+            <w:vAlign w:val="center"/>
+          </w:tcPr>
+          <w:p>
+            <w:pPr>
+              <w:spacing w:after="40"/>
+            </w:pPr>
+            <w:r>
+              <w:t xml:space="preserve">2.4</w:t>
+            </w:r>
+          </w:p>
+        </w:tc>
+      </w:tr>
+    </w:tbl>
+    <w:p>
+      <w:pPr>
+        <w:spacing w:after="120"/>
+      </w:pPr>
+    </w:p>
+    <w:p>
+      <w:pPr>
+        <w:spacing w:after="60"/>
+      </w:pPr>
+      <w:r>
+        <w:rPr>
+          <w:b/>
+          <w:sz w:val="20"/>
+          <w:szCs w:val="20"/>
+        </w:rPr>
+        <w:t xml:space="preserve">Tabel P2  Pemetaan Nama File Gambar (SVG) ke Nomor Gambar di Master</w:t>
+      </w:r>
+    </w:p>
+    <w:tbl>
+      <w:tblPr>
+        <w:tblStyle w:val="TableGrid"/>
+        <w:tblW w:w="9300" w:type="dxa"/>
+        <w:tblBorders>
+          <w:top w:val="single" w:sz="4" w:space="0" w:color="808080"/>
+          <w:left w:val="single" w:sz="4" w:space="0" w:color="808080"/>
+          <w:bottom w:val="single" w:sz="4" w:space="0" w:color="808080"/>
+          <w:right w:val="single" w:sz="4" w:space="0" w:color="808080"/>
+          <w:insideH w:val="single" w:sz="4" w:space="0" w:color="808080"/>
+          <w:insideV w:val="single" w:sz="4" w:space="0" w:color="808080"/>
+        </w:tblBorders>
+      </w:tblPr>
+      <w:tblGrid>
+        <w:gridCol w:w="3300"/>
+        <w:gridCol w:w="3500"/>
+        <w:gridCol w:w="2500"/>
+      </w:tblGrid>
+      <w:tr>
+        <w:trPr>
+          <w:tblHeader/>
+        </w:trPr>
+        <w:tc>
+          <w:tcPr>
+            <w:tcW w:w="3300" w:type="dxa"/>
+            <w:shd w:val="clear" w:color="auto" w:fill="D9E2F3"/>
+            <w:vAlign w:val="center"/>
+          </w:tcPr>
+          <w:p>
+            <w:pPr>
+              <w:spacing w:after="40"/>
+              <w:jc w:val="center"/>
+            </w:pPr>
+            <w:r>
+              <w:rPr>
+                <w:b/>
+              </w:rPr>
+              <w:t xml:space="preserve">File SVG</w:t>
+            </w:r>
+          </w:p>
+        </w:tc>
+        <w:tc>
+          <w:tcPr>
+            <w:tcW w:w="3500" w:type="dxa"/>
+            <w:shd w:val="clear" w:color="auto" w:fill="D9E2F3"/>
+            <w:vAlign w:val="center"/>
+          </w:tcPr>
+          <w:p>
+            <w:pPr>
+              <w:spacing w:after="40"/>
+              <w:jc w:val="center"/>
+            </w:pPr>
+            <w:r>
+              <w:rPr>
+                <w:b/>
+              </w:rPr>
+              <w:t xml:space="preserve">Nomor Gambar di Master</w:t>
+            </w:r>
+          </w:p>
+        </w:tc>
+        <w:tc>
+          <w:tcPr>
+            <w:tcW w:w="2500" w:type="dxa"/>
+            <w:shd w:val="clear" w:color="auto" w:fill="D9E2F3"/>
+            <w:vAlign w:val="center"/>
+          </w:tcPr>
+          <w:p>
+            <w:pPr>
+              <w:spacing w:after="40"/>
+              <w:jc w:val="center"/>
+            </w:pPr>
+            <w:r>
+              <w:rPr>
+                <w:b/>
+              </w:rPr>
+              <w:t xml:space="preserve">Keterangan</w:t>
+            </w:r>
+          </w:p>
+        </w:tc>
+      </w:tr>
+      <w:tr>
+        <w:tc>
+          <w:tcPr>
+            <w:tcW w:w="3300" w:type="dxa"/>
+            <w:vAlign w:val="center"/>
+          </w:tcPr>
+          <w:p>
+            <w:pPr>
+              <w:spacing w:after="40"/>
+            </w:pPr>
+            <w:r>
+              <w:t xml:space="preserve">gambar1_flowchart_eksisting.svg</w:t>
+            </w:r>
+          </w:p>
+        </w:tc>
+        <w:tc>
+          <w:tcPr>
+            <w:tcW w:w="3500" w:type="dxa"/>
+            <w:vAlign w:val="center"/>
+          </w:tcPr>
+          <w:p>
+            <w:pPr>
+              <w:spacing w:after="40"/>
+            </w:pPr>
+            <w:r>
+              <w:t xml:space="preserve">Gambar 1 Proses Eksisting</w:t>
+            </w:r>
+          </w:p>
+        </w:tc>
+        <w:tc>
+          <w:tcPr>
+            <w:tcW w:w="2500" w:type="dxa"/>
+            <w:vAlign w:val="center"/>
+          </w:tcPr>
+          <w:p>
+            <w:pPr>
+              <w:spacing w:after="40"/>
+            </w:pPr>
+            <w:r>
+              <w:t xml:space="preserve">Sudah ada slot</w:t>
+            </w:r>
+          </w:p>
+        </w:tc>
+      </w:tr>
+      <w:tr>
+        <w:tc>
+          <w:tcPr>
+            <w:tcW w:w="3300" w:type="dxa"/>
+            <w:vAlign w:val="center"/>
+          </w:tcPr>
+          <w:p>
+            <w:pPr>
+              <w:spacing w:after="40"/>
+            </w:pPr>
+            <w:r>
+              <w:t xml:space="preserve">gambar2_pareto.svg</w:t>
+            </w:r>
+          </w:p>
+        </w:tc>
+        <w:tc>
+          <w:tcPr>
+            <w:tcW w:w="3500" w:type="dxa"/>
+            <w:vAlign w:val="center"/>
+          </w:tcPr>
+          <w:p>
+            <w:pPr>
+              <w:spacing w:after="40"/>
+            </w:pPr>
+            <w:r>
+              <w:t xml:space="preserve">Gambar 3 Grafik Masalah Ticket HD</w:t>
+            </w:r>
+          </w:p>
+        </w:tc>
+        <w:tc>
+          <w:tcPr>
+            <w:tcW w:w="2500" w:type="dxa"/>
+            <w:vAlign w:val="center"/>
+          </w:tcPr>
+          <w:p>
+            <w:pPr>
+              <w:spacing w:after="40"/>
+            </w:pPr>
+            <w:r>
+              <w:t xml:space="preserve">Sudah ada slot</w:t>
+            </w:r>
+          </w:p>
+        </w:tc>
+      </w:tr>
+      <w:tr>
+        <w:tc>
+          <w:tcPr>
+            <w:tcW w:w="3300" w:type="dxa"/>
+            <w:vAlign w:val="center"/>
+          </w:tcPr>
+          <w:p>
+            <w:pPr>
+              <w:spacing w:after="40"/>
+            </w:pPr>
+            <w:r>
+              <w:t xml:space="preserve">gambar3_before_after.svg</w:t>
+            </w:r>
+          </w:p>
+        </w:tc>
+        <w:tc>
+          <w:tcPr>
+            <w:tcW w:w="3500" w:type="dxa"/>
+            <w:vAlign w:val="center"/>
+          </w:tcPr>
+          <w:p>
+            <w:pPr>
+              <w:spacing w:after="40"/>
+            </w:pPr>
+            <w:r>
+              <w:t xml:space="preserve">Gambar 4 Before - After</w:t>
+            </w:r>
+          </w:p>
+        </w:tc>
+        <w:tc>
+          <w:tcPr>
+            <w:tcW w:w="2500" w:type="dxa"/>
+            <w:vAlign w:val="center"/>
+          </w:tcPr>
+          <w:p>
+            <w:pPr>
+              <w:spacing w:after="40"/>
+            </w:pPr>
+            <w:r>
+              <w:t xml:space="preserve">Sudah ada slot (angka diperbarui)</w:t>
+            </w:r>
+          </w:p>
+        </w:tc>
+      </w:tr>
+      <w:tr>
+        <w:tc>
+          <w:tcPr>
+            <w:tcW w:w="3300" w:type="dxa"/>
+            <w:vAlign w:val="center"/>
+          </w:tcPr>
+          <w:p>
+            <w:pPr>
+              <w:spacing w:after="40"/>
+            </w:pPr>
+            <w:r>
+              <w:t xml:space="preserve">gambar4_data_pending.svg</w:t>
+            </w:r>
+          </w:p>
+        </w:tc>
+        <w:tc>
+          <w:tcPr>
+            <w:tcW w:w="3500" w:type="dxa"/>
+            <w:vAlign w:val="center"/>
+          </w:tcPr>
+          <w:p>
+            <w:pPr>
+              <w:spacing w:after="40"/>
+            </w:pPr>
+            <w:r>
+              <w:t xml:space="preserve">GAMBAR BARU (sisipkan di 1.1)</w:t>
+            </w:r>
+          </w:p>
+        </w:tc>
+        <w:tc>
+          <w:tcPr>
+            <w:tcW w:w="2500" w:type="dxa"/>
+            <w:vAlign w:val="center"/>
+          </w:tcPr>
+          <w:p>
+            <w:pPr>
+              <w:spacing w:after="40"/>
+            </w:pPr>
+            <w:r>
+              <w:t xml:space="preserve">Tambahkan ke Daftar Gambar &amp; sesuaikan penomoran berikutnya</w:t>
+            </w:r>
+          </w:p>
+        </w:tc>
+      </w:tr>
+      <w:tr>
+        <w:tc>
+          <w:tcPr>
+            <w:tcW w:w="3300" w:type="dxa"/>
+            <w:vAlign w:val="center"/>
+          </w:tcPr>
+          <w:p>
+            <w:pPr>
+              <w:spacing w:after="40"/>
+            </w:pPr>
+            <w:r>
+              <w:t xml:space="preserve">gambar5_fishbone.svg</w:t>
+            </w:r>
+          </w:p>
+        </w:tc>
+        <w:tc>
+          <w:tcPr>
+            <w:tcW w:w="3500" w:type="dxa"/>
+            <w:vAlign w:val="center"/>
+          </w:tcPr>
+          <w:p>
+            <w:pPr>
+              <w:spacing w:after="40"/>
+            </w:pPr>
+            <w:r>
+              <w:t xml:space="preserve">Gambar 5 Fishbone Diagram</w:t>
+            </w:r>
+          </w:p>
+        </w:tc>
+        <w:tc>
+          <w:tcPr>
+            <w:tcW w:w="2500" w:type="dxa"/>
+            <w:vAlign w:val="center"/>
+          </w:tcPr>
+          <w:p>
+            <w:pPr>
+              <w:spacing w:after="40"/>
+            </w:pPr>
+            <w:r>
+              <w:t xml:space="preserve">Sudah ada slot</w:t>
+            </w:r>
+          </w:p>
+        </w:tc>
+      </w:tr>
+    </w:tbl>
+    <w:p>
+      <w:pPr>
+        <w:spacing w:after="120"/>
+      </w:pPr>
+    </w:p>
+    <w:p>
+      <w:pPr>
+        <w:spacing w:after="200"/>
+      </w:pPr>
+      <w:r>
+        <w:rPr>
+          <w:i/>
+          <w:sz w:val="18"/>
+          <w:szCs w:val="18"/>
+        </w:rPr>
+        <w:t xml:space="preserve">Catatan penomoran: penyisipan infografik data pending di sub-bab 1.1 menambah satu gambar baru. Setelah disisipkan, perbarui Daftar Gambar dan geser penomoran gambar setelahnya (+1) atau beri nomor menyesuaikan urutan final di dokumen master.</w:t>
+      </w:r>
+    </w:p>
+    <w:p>
+      <w:pPr>
+        <w:spacing w:after="120"/>
+      </w:pPr>
+      <w:r>
+        <w:rPr>
+          <w:b/>
+          <w:sz w:val="28"/>
+          <w:szCs w:val="28"/>
+          <w:color w:val="1F3864"/>
+        </w:rPr>
         <w:t xml:space="preserve">BAGIAN A - KOREKSI LANGKAH 1 (DATA AKTUAL)</w:t>
       </w:r>
     </w:p>
@@ -63,7 +824,19 @@
         <w:spacing w:after="120"/>
       </w:pPr>
       <w:r>
-        <w:t xml:space="preserve">Pada versi sebelumnya, besaran kasus pending dan dampak finansial masih menggunakan angka estimasi. Setelah aplikasi VolMon beroperasi, diperoleh data aktual rata-rata kondisi data yang tertahan (nyangkut) per minggu sebagaimana tabel berikut. Data ini menggantikan angka estimasi sehingga identifikasi masalah menjadi lebih kuat dan dapat dipertanggungjawabkan.</w:t>
+        <w:t xml:space="preserve">Pada versi sebelumnya, besaran kasus pending dan dampak finansial masih menggunakan angka estimasi. Bagian ini menggantikannya dengan data aktual hasil penyisiran/observasi awal (baseline) periode Oktober-Desember 2025 sehingga identifikasi masalah menjadi lebih kuat dan dapat dipertanggungjawabkan. Catatan: data baseline yang sama akan digunakan kembali sebagai pembanding pada Langkah 6 (Mengevaluasi Solusi).</w:t>
+      </w:r>
+    </w:p>
+    <w:p>
+      <w:pPr>
+        <w:spacing w:after="120"/>
+      </w:pPr>
+      <w:r>
+        <w:rPr>
+          <w:i/>
+          <w:color w:val="7F6000"/>
+        </w:rPr>
+        <w:t xml:space="preserve">Kalimat jembatan (sebelum Tabel A1): “Selain tercermin dari tiket helpdesk, besarnya keterlambatan sinkronisasi data gate juga dapat diukur secara langsung dari kondisi data yang tertahan (pending) pada gate. Berdasarkan hasil monitoring penyisiran awal, rata-rata kondisi data pending per minggu adalah sebagai berikut.”</w:t>
       </w:r>
     </w:p>
     <w:p>
@@ -522,7 +1295,24 @@
         <w:spacing w:after="120"/>
       </w:pPr>
       <w:r>
-        <w:t xml:space="preserve">Berdasarkan Tabel A1, secara rata-rata terdapat 192 gate bermasalah setiap minggu (149 pending dan 43 error) yang menahan 583.543 transaksi serta revenue senilai Rp932.412.856 dari pencatatan tepat waktu di server pusat. Sebagai gambaran kondisi pada level stasiun, berikut contoh data gate yang terdeteksi bermasalah.</w:t>
+        <w:rPr>
+          <w:i/>
+          <w:sz w:val="18"/>
+          <w:szCs w:val="18"/>
+        </w:rPr>
+        <w:t xml:space="preserve">Sumber: hasil penyisiran/observasi awal (data baseline), periode Okt-Des 2025.</w:t>
+      </w:r>
+    </w:p>
+    <w:p>
+      <w:pPr>
+        <w:spacing w:after="120"/>
+      </w:pPr>
+      <w:r>
+        <w:rPr>
+          <w:i/>
+          <w:color w:val="7F6000"/>
+        </w:rPr>
+        <w:t xml:space="preserve">Kalimat jembatan (antara Tabel A1 dan A2): “Sebagai gambaran kondisi pada level stasiun, berikut contoh detail gate yang terdeteksi mengalami pending data.”</w:t>
       </w:r>
     </w:p>
     <w:p>
@@ -896,7 +1686,19 @@
           <w:i/>
           <w:color w:val="808080"/>
         </w:rPr>
-        <w:t xml:space="preserve">[GAMBAR 4: Infografik Rata-rata Kondisi Data Pending per Minggu - file gambar4_data_pending.svg]</w:t>
+        <w:t xml:space="preserve">[GAMBAR (baru): Infografik Rata-rata Kondisi Data Pending per Minggu - file gambar4_data_pending.svg. Letakkan tepat setelah Tabel A2.]</w:t>
+      </w:r>
+    </w:p>
+    <w:p>
+      <w:pPr>
+        <w:spacing w:after="120"/>
+      </w:pPr>
+      <w:r>
+        <w:rPr>
+          <w:i/>
+          <w:color w:val="7F6000"/>
+        </w:rPr>
+        <w:t xml:space="preserve">Kalimat jembatan (setelah Tabel A2 / Gambar, menuju 1.2 Dampak): “Besarnya volume transaksi dan revenue yang tertahan tersebut menegaskan bahwa keterlambatan sinkronisasi data gate berdampak langsung terhadap keandalan data operasional dan pendapatan perusahaan, sebagaimana diuraikan pada analisa dampak berikut.”</w:t>
       </w:r>
     </w:p>
     <w:p>
@@ -1263,7 +2065,33 @@
         <w:spacing w:after="60"/>
       </w:pPr>
       <w:r>
-        <w:t xml:space="preserve">Menambahkan Tabel A1 (data aktual kondisi data pending per minggu) dari aplikasi VolMon.</w:t>
+        <w:t xml:space="preserve">Menambahkan Tabel A1 (data baseline kondisi data pending per minggu hasil penyisiran/observasi awal).</w:t>
+      </w:r>
+    </w:p>
+    <w:p>
+      <w:pPr>
+        <w:pStyle w:val="ListParagraph"/>
+        <w:numPr>
+          <w:ilvl w:val="0"/>
+          <w:numId w:val="1"/>
+        </w:numPr>
+        <w:spacing w:after="60"/>
+      </w:pPr>
+      <w:r>
+        <w:t xml:space="preserve">Menambahkan kalimat jembatan sebelum, di antara, dan sesudah Tabel A1-A2 agar alur mengalir.</w:t>
+      </w:r>
+    </w:p>
+    <w:p>
+      <w:pPr>
+        <w:pStyle w:val="ListParagraph"/>
+        <w:numPr>
+          <w:ilvl w:val="0"/>
+          <w:numId w:val="1"/>
+        </w:numPr>
+        <w:spacing w:after="60"/>
+      </w:pPr>
+      <w:r>
+        <w:t xml:space="preserve">Mengubah atribusi sumber data dari ‘aplikasi VolMon’ menjadi ‘penyisiran/observasi awal (baseline)’ untuk menjaga logika Langkah 1.</w:t>
       </w:r>
     </w:p>
     <w:p>

</xml_diff>